<commit_message>
not working 2 create files
</commit_message>
<xml_diff>
--- a/document-service/internal/documents/zayavlenie-below-eighteen.docx
+++ b/document-service/internal/documents/zayavlenie-below-eighteen.docx
@@ -213,15 +213,7 @@
                 <w:bCs/>
                 <w:lang w:val="en-US"/>
               </w:rPr>
-              <w:t>CITY</w:t>
-            </w:r>
-            <w:r>
-              <w:rPr>
-                <w:rFonts w:ascii="Montserrat" w:eastAsia="Montserrat" w:hAnsi="Montserrat" w:cs="Montserrat"/>
-                <w:bCs/>
-                <w:lang w:val="en-US"/>
-              </w:rPr>
-              <w:t>B</w:t>
+              <w:t>FCI</w:t>
             </w:r>
           </w:p>
         </w:tc>
@@ -299,14 +291,6 @@
                 <w:lang w:val="en-US"/>
               </w:rPr>
               <w:t>DATEGIVEN</w:t>
-            </w:r>
-            <w:r>
-              <w:rPr>
-                <w:rFonts w:ascii="Montserrat" w:eastAsia="Montserrat" w:hAnsi="Montserrat" w:cs="Montserrat"/>
-                <w:color w:val="000000"/>
-                <w:lang w:val="en-US"/>
-              </w:rPr>
-              <w:t>S</w:t>
             </w:r>
           </w:p>
         </w:tc>
@@ -999,16 +983,7 @@
               <w:szCs w:val="16"/>
               <w:lang w:val="en-US"/>
             </w:rPr>
-            <w:t>VARIANT</w:t>
-          </w:r>
-          <w:r>
-            <w:rPr>
-              <w:rFonts w:ascii="Arial Unicode MS" w:eastAsia="Arial Unicode MS" w:hAnsi="Arial Unicode MS" w:cs="Arial Unicode MS"/>
-              <w:sz w:val="16"/>
-              <w:szCs w:val="16"/>
-              <w:lang w:val="ru-RU"/>
-            </w:rPr>
-            <w:t>1</w:t>
+            <w:t>ONE</w:t>
           </w:r>
         </w:sdtContent>
       </w:sdt>
@@ -1049,16 +1024,7 @@
               <w:szCs w:val="16"/>
               <w:lang w:val="en-US"/>
             </w:rPr>
-            <w:t>VARIANT</w:t>
-          </w:r>
-          <w:r>
-            <w:rPr>
-              <w:rFonts w:ascii="Arial Unicode MS" w:eastAsia="Arial Unicode MS" w:hAnsi="Arial Unicode MS" w:cs="Arial Unicode MS"/>
-              <w:sz w:val="16"/>
-              <w:szCs w:val="16"/>
-              <w:lang w:val="ru-RU"/>
-            </w:rPr>
-            <w:t>2</w:t>
+            <w:t>TWO</w:t>
           </w:r>
         </w:sdtContent>
       </w:sdt>
@@ -1099,16 +1065,7 @@
               <w:szCs w:val="16"/>
               <w:lang w:val="en-US"/>
             </w:rPr>
-            <w:t>VARIANT</w:t>
-          </w:r>
-          <w:r>
-            <w:rPr>
-              <w:rFonts w:ascii="Arial Unicode MS" w:eastAsia="Arial Unicode MS" w:hAnsi="Arial Unicode MS" w:cs="Arial Unicode MS"/>
-              <w:sz w:val="16"/>
-              <w:szCs w:val="16"/>
-              <w:lang w:val="ru-RU"/>
-            </w:rPr>
-            <w:t>3</w:t>
+            <w:t>THREE</w:t>
           </w:r>
         </w:sdtContent>
       </w:sdt>
@@ -1149,16 +1106,7 @@
               <w:szCs w:val="16"/>
               <w:lang w:val="en-US"/>
             </w:rPr>
-            <w:t>VARIANT</w:t>
-          </w:r>
-          <w:r>
-            <w:rPr>
-              <w:rFonts w:ascii="Arial Unicode MS" w:eastAsia="Arial Unicode MS" w:hAnsi="Arial Unicode MS" w:cs="Arial Unicode MS"/>
-              <w:sz w:val="16"/>
-              <w:szCs w:val="16"/>
-              <w:lang w:val="ru-RU"/>
-            </w:rPr>
-            <w:t>4</w:t>
+            <w:t>FOUR</w:t>
           </w:r>
         </w:sdtContent>
       </w:sdt>
@@ -1199,16 +1147,7 @@
               <w:szCs w:val="16"/>
               <w:lang w:val="en-US"/>
             </w:rPr>
-            <w:t>VARIANT</w:t>
-          </w:r>
-          <w:r>
-            <w:rPr>
-              <w:rFonts w:ascii="Arial Unicode MS" w:eastAsia="Arial Unicode MS" w:hAnsi="Arial Unicode MS" w:cs="Arial Unicode MS"/>
-              <w:sz w:val="16"/>
-              <w:szCs w:val="16"/>
-              <w:lang w:val="ru-RU"/>
-            </w:rPr>
-            <w:t>5</w:t>
+            <w:t>FIVE</w:t>
           </w:r>
         </w:sdtContent>
       </w:sdt>
@@ -1249,16 +1188,7 @@
               <w:szCs w:val="16"/>
               <w:lang w:val="en-US"/>
             </w:rPr>
-            <w:t>VARIANT</w:t>
-          </w:r>
-          <w:r>
-            <w:rPr>
-              <w:rFonts w:ascii="Arial Unicode MS" w:eastAsia="Arial Unicode MS" w:hAnsi="Arial Unicode MS" w:cs="Arial Unicode MS"/>
-              <w:sz w:val="16"/>
-              <w:szCs w:val="16"/>
-              <w:lang w:val="ru-RU"/>
-            </w:rPr>
-            <w:t>6</w:t>
+            <w:t>SIX</w:t>
           </w:r>
         </w:sdtContent>
       </w:sdt>

</xml_diff>